<commit_message>
fix(peticoes): remove ", em [data do contrato]," da homologação
A frase ", em [data do contrato]," foi retirada do modelo. Resultado:
"...peticionário(a) celebrou contrato(s) oneroso(s) de cessão..."

Mudanças:
  - _PETICAO_TIPO_MAP: homologacao agora tem fields=[] (sem inputs do
    usuário — o modal abre só com a info do processo e o botão "Gerar").
  - _build_template.py: pós-processamento específico do tipo homologacao
    remove "celebrou, em " → "celebrou ", apaga o placeholder
    {{DATA_CONTRATO}} e remove a vírgula que vinha antes de "contrato(s)".

Co-Authored-By: Claude Opus 4.7 (1M context) <noreply@anthropic.com>
</commit_message>
<xml_diff>
--- a/supabase/seeds/peticoes-templates/homologacao.docx
+++ b/supabase/seeds/peticoes-templates/homologacao.docx
@@ -520,7 +520,7 @@
           <w:rtl w:val="0"/>
         </w:rPr>
         <w:tab/>
-        <w:t xml:space="preserve">Conforme se extrai dos documentos ora acostados, o(a) peticionário(a) celebrou, em </w:t>
+        <w:t xml:space="preserve">Conforme se extrai dos documentos ora acostados, o(a) peticionário(a) celebrou </w:t>
       </w:r>
       <w:r/>
       <w:r>
@@ -530,7 +530,7 @@
           <w:szCs w:val="24"/>
           <w:rtl w:val="0"/>
         </w:rPr>
-        <w:t xml:space="preserve">{{DATA_CONTRATO}}</w:t>
+        <w:t xml:space="preserve"/>
       </w:r>
       <w:r/>
       <w:r>
@@ -540,7 +540,7 @@
           <w:szCs w:val="24"/>
           <w:rtl w:val="0"/>
         </w:rPr>
-        <w:t xml:space="preserve">, contrato(s) oneroso(s) de cessão de crédito judicial referente ao presente feito, por meio do qual assumiu a titularidade plena do</w:t>
+        <w:t xml:space="preserve">contrato(s) oneroso(s) de cessão de crédito judicial referente ao presente feito, por meio do qual assumiu a titularidade plena do</w:t>
       </w:r>
       <w:r>
         <w:rPr>

</xml_diff>